<commit_message>
pushing updated mod 9 files
</commit_message>
<xml_diff>
--- a/module-9/Sengvanhpheng-Assignment_9_2.docx
+++ b/module-9/Sengvanhpheng-Assignment_9_2.docx
@@ -46,6 +46,22 @@
           <w:b w:val="1"/>
           <w:bCs w:val="1"/>
         </w:rPr>
+        <w:t>Tutorial API:</w:t>
+      </w:r>
+    </w:p>
+    <w:p>
+      <w:pPr>
+        <w:pStyle w:val="Normal"/>
+        <w:rPr>
+          <w:b w:val="1"/>
+          <w:bCs w:val="1"/>
+        </w:rPr>
+      </w:pPr>
+      <w:r>
+        <w:rPr>
+          <w:b w:val="1"/>
+          <w:bCs w:val="1"/>
+        </w:rPr>
         <w:t xml:space="preserve">Used URL listed above in the </w:t>
       </w:r>
       <w:r>
@@ -104,7 +120,7 @@
       </w:pPr>
       <w:r>
         <w:drawing>
-          <wp:inline wp14:editId="769060B3" wp14:anchorId="7F5C737C">
+          <wp:inline wp14:editId="710C933A" wp14:anchorId="7F5C737C">
             <wp:extent cx="5943600" cy="3219450"/>
             <wp:effectExtent l="0" t="0" r="0" b="0"/>
             <wp:docPr id="9966251" name="drawing"/>
@@ -178,7 +194,7 @@
       </w:pPr>
       <w:r>
         <w:drawing>
-          <wp:inline wp14:editId="349F4020" wp14:anchorId="38954451">
+          <wp:inline wp14:editId="5FF8250D" wp14:anchorId="38954451">
             <wp:extent cx="5943600" cy="3114675"/>
             <wp:effectExtent l="0" t="0" r="0" b="0"/>
             <wp:docPr id="2145247884" name="drawing"/>
@@ -223,6 +239,18 @@
     <w:p>
       <w:pPr>
         <w:pStyle w:val="Normal"/>
+      </w:pPr>
+      <w:r>
+        <w:rPr>
+          <w:b w:val="1"/>
+          <w:bCs w:val="1"/>
+        </w:rPr>
+        <w:t>My API choice:</w:t>
+      </w:r>
+    </w:p>
+    <w:p>
+      <w:pPr>
+        <w:pStyle w:val="Normal"/>
         <w:rPr>
           <w:b w:val="1"/>
           <w:bCs w:val="1"/>
@@ -256,7 +284,7 @@
       </w:pPr>
       <w:r>
         <w:drawing>
-          <wp:inline wp14:editId="45F26BDF" wp14:anchorId="62D151A5">
+          <wp:inline wp14:editId="31BFAAEC" wp14:anchorId="62D151A5">
             <wp:extent cx="5943600" cy="3209925"/>
             <wp:effectExtent l="0" t="0" r="0" b="0"/>
             <wp:docPr id="1150428590" name="drawing"/>

</xml_diff>